<commit_message>
ICDMAI paper: stop Figure 3 leaving a blank half page
Let a page break fall between the two screenshots of Figure 3 so the block
no longer jumps whole to the next page; add an output-folder option to the
build script; rebuild both Word files.

Co-Authored-By: Claude Sonnet 5.5 <noreply@anthropic.com>
</commit_message>
<xml_diff>
--- a/Submission Documents/ICDMAI/ICDMAI_paper_anonymous.docx
+++ b/Submission Documents/ICDMAI/ICDMAI_paper_anonymous.docx
@@ -2715,7 +2715,7 @@
     </w:p>
     <w:p>
       <w:pPr>
-        <w:keepNext/>
+        <w:keepNext w:val="false"/>
         <w:spacing w:after="80" w:line="240"/>
         <w:jc w:val="center"/>
       </w:pPr>
@@ -5138,7 +5138,7 @@
       <w:r>
         <w:t xml:space="preserve">Boeing, G.: OSMnx: New methods for acquiring, constructing, analyzing, and visualizing complex street networks. Computers, Environment and Urban Systems 65, 126–139 (2017). </w:t>
       </w:r>
-      <w:hyperlink w:history="1" r:id="rIdo5teii7y8avw9gfawgszx">
+      <w:hyperlink w:history="1" r:id="rIdftauwzgnr_tq5u7mblfao">
         <w:r>
           <w:rPr>
             <w:rStyle w:val="Hyperlink"/>
@@ -5162,7 +5162,7 @@
       <w:r>
         <w:t xml:space="preserve">Felt: Felt AI: AI-powered GIS and mapping platform. Felt Help Center (2025). </w:t>
       </w:r>
-      <w:hyperlink w:history="1" r:id="rIdvwup2lykb3hwhyebjw9vx">
+      <w:hyperlink w:history="1" r:id="rIdavg7oetc_zkouadgd9zva">
         <w:r>
           <w:rPr>
             <w:rStyle w:val="Hyperlink"/>
@@ -5186,7 +5186,7 @@
       <w:r>
         <w:t xml:space="preserve">Haklay, M., Weber, P.: OpenStreetMap: User-generated street maps. IEEE Pervasive Computing 7(4), 12–18 (2008). </w:t>
       </w:r>
-      <w:hyperlink w:history="1" r:id="rId505ajjy2wm_g7yhrq2nsy">
+      <w:hyperlink w:history="1" r:id="rIdjilqxaujznqjapovg63mk">
         <w:r>
           <w:rPr>
             <w:rStyle w:val="Hyperlink"/>
@@ -5210,7 +5210,7 @@
       <w:r>
         <w:t xml:space="preserve">Kazazi, A.K., Li, Z., Lessani, M.N., Cervone, G.: From questions to queries: An AI-powered multi-agent framework for spatial text-to-SQL. arXiv preprint arXiv:2510.21045 (2025). </w:t>
       </w:r>
-      <w:hyperlink w:history="1" r:id="rId9cmqtkbmqjcxks-lnzp3t">
+      <w:hyperlink w:history="1" r:id="rId4xp3kw85cccgcas8vwhnj">
         <w:r>
           <w:rPr>
             <w:rStyle w:val="Hyperlink"/>
@@ -5234,7 +5234,7 @@
       <w:r>
         <w:t xml:space="preserve">Li, J., Hui, B., Qu, G., et al.: Can LLM already serve as a database interface? A big bench for large-scale database grounded text-to-SQLs. In: Advances in Neural Information Processing Systems (NeurIPS) (2023). </w:t>
       </w:r>
-      <w:hyperlink w:history="1" r:id="rIdaszuwku7xgqwmfmp0gmc6">
+      <w:hyperlink w:history="1" r:id="rIdvmkcx64wzxdos-yb64q_h">
         <w:r>
           <w:rPr>
             <w:rStyle w:val="Hyperlink"/>
@@ -5274,7 +5274,7 @@
       <w:r>
         <w:t xml:space="preserve">Mansourian, A., Oucheikh, R.: ChatGeoAI: Enabling geospatial analysis for public through natural language, with large language models. ISPRS International Journal of Geo-Information 13(10), 348 (2024). </w:t>
       </w:r>
-      <w:hyperlink w:history="1" r:id="rId0l8fkgbosbjhcjue9fkje">
+      <w:hyperlink w:history="1" r:id="rIdpvrmdwvz6rl4ji_y59wm7">
         <w:r>
           <w:rPr>
             <w:rStyle w:val="Hyperlink"/>
@@ -5298,7 +5298,7 @@
       <w:r>
         <w:t xml:space="preserve">Manvi, R., Khanna, S., Mai, G., Burke, M., Lobell, D., Ermon, S.: GeoLLM: Extracting geospatial knowledge from large language models. In: International Conference on Learning Representations (ICLR) (2024). </w:t>
       </w:r>
-      <w:hyperlink w:history="1" r:id="rIdz3fkfkcemcjreanh3xnez">
+      <w:hyperlink w:history="1" r:id="rId0d1wvzbd-n8l7m37lolpz">
         <w:r>
           <w:rPr>
             <w:rStyle w:val="Hyperlink"/>
@@ -5322,7 +5322,7 @@
       <w:r>
         <w:t xml:space="preserve">Yu, T., Zhang, R., Yang, K., et al.: Spider: A large-scale human-labeled dataset for complex and cross-domain semantic parsing and text-to-SQL task. In: Proceedings of the 2018 Conference on Empirical Methods in Natural Language Processing (EMNLP), pp. 3911–3921. Association for Computational Linguistics, Brussels (2018). </w:t>
       </w:r>
-      <w:hyperlink w:history="1" r:id="rId4gu_p2xdnnu7qqhw4ljyh">
+      <w:hyperlink w:history="1" r:id="rId-rqbssxyrebyw5yayf6zx">
         <w:r>
           <w:rPr>
             <w:rStyle w:val="Hyperlink"/>

</xml_diff>